<commit_message>
Prototype: real downloads (invoice PDFs, CSV reports & statements); docs: refresh PDF/DOCX guide
Co-Authored-By: Claude Opus 5.5 <noreply@anthropic.com>
Claude-Session: https://claude.ai/code/session_017PF1CedVYAD9TTACxkDDRj
</commit_message>
<xml_diff>
--- a/docs/Bike-Pharma-App-Guide.docx
+++ b/docs/Bike-Pharma-App-Guide.docx
@@ -2869,6 +2869,366 @@
         </w:tc>
       </w:tr>
     </w:tbl>
+    <w:p>
+      <w:pPr>
+        <w:pStyle w:val="Heading2"/>
+      </w:pPr>
+      <w:r>
+        <w:t xml:space="preserve">New tools in every profile</w:t>
+      </w:r>
+    </w:p>
+    <w:p>
+      <w:pPr/>
+      <w:r>
+        <w:t xml:space="preserve">This release adds new tools to every role and refreshes the look of the whole app.</w:t>
+      </w:r>
+    </w:p>
+    <w:tbl>
+      <w:tblPr>
+        <w:tblStyle w:val="TableGrid"/>
+        <w:tblW w:w="0" w:type="auto"/>
+        <w:tblLayout w:type="fixed"/>
+        <w:tblLook w:val="04A0" w:firstRow="1" w:lastRow="0" w:firstColumn="0" w:lastColumn="0" w:noHBand="0" w:noVBand="1"/>
+      </w:tblPr>
+      <w:tblGrid>
+        <w:gridCol w:w="3120"/>
+        <w:gridCol w:w="3120"/>
+        <w:gridCol w:w="3120"/>
+      </w:tblGrid>
+      <w:tr>
+        <w:trPr>
+          <w:tblHeader/>
+        </w:trPr>
+        <w:tc>
+          <w:tcPr>
+            <w:tcW w:w="3120" w:type="dxa"/>
+            <w:shd w:val="clear" w:color="auto" w:fill="F2F2F2"/>
+          </w:tcPr>
+          <w:p>
+            <w:pPr/>
+            <w:r>
+              <w:t xml:space="preserve">Role</w:t>
+            </w:r>
+          </w:p>
+        </w:tc>
+        <w:tc>
+          <w:tcPr>
+            <w:tcW w:w="3120" w:type="dxa"/>
+            <w:shd w:val="clear" w:color="auto" w:fill="F2F2F2"/>
+          </w:tcPr>
+          <w:p>
+            <w:pPr/>
+            <w:r>
+              <w:t xml:space="preserve">What's new</w:t>
+            </w:r>
+          </w:p>
+        </w:tc>
+        <w:tc>
+          <w:tcPr>
+            <w:tcW w:w="3120" w:type="dxa"/>
+            <w:shd w:val="clear" w:color="auto" w:fill="F2F2F2"/>
+          </w:tcPr>
+          <w:p>
+            <w:pPr/>
+            <w:r>
+              <w:t xml:space="preserve">Where to find it</w:t>
+            </w:r>
+          </w:p>
+        </w:tc>
+      </w:tr>
+      <w:tr>
+        <w:tc>
+          <w:tcPr>
+            <w:tcW w:w="3120" w:type="dxa"/>
+          </w:tcPr>
+          <w:p>
+            <w:pPr/>
+            <w:r>
+              <w:t xml:space="preserve">Customer</w:t>
+            </w:r>
+          </w:p>
+        </w:tc>
+        <w:tc>
+          <w:tcPr>
+            <w:tcW w:w="3120" w:type="dxa"/>
+          </w:tcPr>
+          <w:p>
+            <w:pPr/>
+            <w:r>
+              <w:t xml:space="preserve">Bike health report: shows which parts are due, based on km. Photo part search. Support chat with WhatsApp. Rating &amp; review after a service (4★ or more adds ₹50 to the wallet). Roadside SOS: sends the nearest open verified mechanic.</w:t>
+            </w:r>
+          </w:p>
+        </w:tc>
+        <w:tc>
+          <w:tcPr>
+            <w:tcW w:w="3120" w:type="dxa"/>
+          </w:tcPr>
+          <w:p>
+            <w:pPr/>
+            <w:r>
+              <w:t xml:space="preserve">Home tiles (Bike health, Photo search, SOS help) · Account → Help · Booking → "Rate the service"</w:t>
+            </w:r>
+          </w:p>
+        </w:tc>
+      </w:tr>
+      <w:tr>
+        <w:tc>
+          <w:tcPr>
+            <w:tcW w:w="3120" w:type="dxa"/>
+          </w:tcPr>
+          <w:p>
+            <w:pPr/>
+            <w:r>
+              <w:t xml:space="preserve">Mechanic</w:t>
+            </w:r>
+          </w:p>
+        </w:tc>
+        <w:tc>
+          <w:tcPr>
+            <w:tcW w:w="3120" w:type="dxa"/>
+          </w:tcPr>
+          <w:p>
+            <w:pPr/>
+            <w:r>
+              <w:t xml:space="preserve">Job cards: customer bike → work → parts → bill, with profit shown. My customers, with service reminders. Booking requests you can accept or decline, with navigation. Quick reorder. Earnings report.</w:t>
+            </w:r>
+          </w:p>
+        </w:tc>
+        <w:tc>
+          <w:tcPr>
+            <w:tcW w:w="3120" w:type="dxa"/>
+          </w:tcPr>
+          <w:p>
+            <w:pPr/>
+            <w:r>
+              <w:t xml:space="preserve">Mechanic home grid</w:t>
+            </w:r>
+          </w:p>
+        </w:tc>
+      </w:tr>
+      <w:tr>
+        <w:tc>
+          <w:tcPr>
+            <w:tcW w:w="3120" w:type="dxa"/>
+          </w:tcPr>
+          <w:p>
+            <w:pPr/>
+            <w:r>
+              <w:t xml:space="preserve">Billing</w:t>
+            </w:r>
+          </w:p>
+        </w:tc>
+        <w:tc>
+          <w:tcPr>
+            <w:tcW w:w="3120" w:type="dxa"/>
+          </w:tcPr>
+          <w:p>
+            <w:pPr/>
+            <w:r>
+              <w:t xml:space="preserve">Hold bill and resume it later. Estimate / quotation print. Counter returns and exchange, against a bill only (refund to wallet, cash or UPI, or exchange). Day closing: count the cash by notes and compare with the expected amount. A difference over ₹50 goes to the Manager. Extra discount: Billing can give up to 2% directly; up to 10% needs Manager approval and anything above needs Admin approval.</w:t>
+            </w:r>
+          </w:p>
+        </w:tc>
+        <w:tc>
+          <w:tcPr>
+            <w:tcW w:w="3120" w:type="dxa"/>
+          </w:tcPr>
+          <w:p>
+            <w:pPr/>
+            <w:r>
+              <w:t xml:space="preserve">Billing home → Quick actions · Invoice footer</w:t>
+            </w:r>
+          </w:p>
+        </w:tc>
+      </w:tr>
+      <w:tr>
+        <w:tc>
+          <w:tcPr>
+            <w:tcW w:w="3120" w:type="dxa"/>
+          </w:tcPr>
+          <w:p>
+            <w:pPr/>
+            <w:r>
+              <w:t xml:space="preserve">Sales Executive</w:t>
+            </w:r>
+          </w:p>
+        </w:tc>
+        <w:tc>
+          <w:tcPr>
+            <w:tcW w:w="3120" w:type="dxa"/>
+          </w:tcPr>
+          <w:p>
+            <w:pPr/>
+            <w:r>
+              <w:t xml:space="preserve">Beat plan with GPS check-in and visit outcome. Field KYC for a new mechanic, sent to Admin for approval. My target &amp; incentive slabs. Field payment collection with a WhatsApp receipt. Cash from the field is confirmed at Billing day closing.</w:t>
+            </w:r>
+          </w:p>
+        </w:tc>
+        <w:tc>
+          <w:tcPr>
+            <w:tcW w:w="3120" w:type="dxa"/>
+          </w:tcPr>
+          <w:p>
+            <w:pPr/>
+            <w:r>
+              <w:t xml:space="preserve">Sales home → Quick actions</w:t>
+            </w:r>
+          </w:p>
+        </w:tc>
+      </w:tr>
+      <w:tr>
+        <w:tc>
+          <w:tcPr>
+            <w:tcW w:w="3120" w:type="dxa"/>
+          </w:tcPr>
+          <w:p>
+            <w:pPr/>
+            <w:r>
+              <w:t xml:space="preserve">Inventory</w:t>
+            </w:r>
+          </w:p>
+        </w:tc>
+        <w:tc>
+          <w:tcPr>
+            <w:tcW w:w="3120" w:type="dxa"/>
+          </w:tcPr>
+          <w:p>
+            <w:pPr/>
+            <w:r>
+              <w:t xml:space="preserve">Expiry &amp; batch tracking, with the earliest expiry sold first (FEFO). Cycle count: one rack a day; any difference goes to the Manager for approval. Supplier returns with a debit note, then mark the credit note when it arrives. Barcode and rack label printing.</w:t>
+            </w:r>
+          </w:p>
+        </w:tc>
+        <w:tc>
+          <w:tcPr>
+            <w:tcW w:w="3120" w:type="dxa"/>
+          </w:tcPr>
+          <w:p>
+            <w:pPr/>
+            <w:r>
+              <w:t xml:space="preserve">Inventory home → Actions</w:t>
+            </w:r>
+          </w:p>
+        </w:tc>
+      </w:tr>
+      <w:tr>
+        <w:tc>
+          <w:tcPr>
+            <w:tcW w:w="3120" w:type="dxa"/>
+          </w:tcPr>
+          <w:p>
+            <w:pPr/>
+            <w:r>
+              <w:t xml:space="preserve">Manager</w:t>
+            </w:r>
+          </w:p>
+        </w:tc>
+        <w:tc>
+          <w:tcPr>
+            <w:tcW w:w="3120" w:type="dxa"/>
+          </w:tcPr>
+          <w:p>
+            <w:pPr/>
+            <w:r>
+              <w:t xml:space="preserve">Staff performance scores. Daily WhatsApp summary: choose what to include, the time and who gets it. Discount approvals up to 10%. Expenses &amp; real profit (gross margin minus branch expenses). Shortcuts to day closing, expiry alerts and cycle count.</w:t>
+            </w:r>
+          </w:p>
+        </w:tc>
+        <w:tc>
+          <w:tcPr>
+            <w:tcW w:w="3120" w:type="dxa"/>
+          </w:tcPr>
+          <w:p>
+            <w:pPr/>
+            <w:r>
+              <w:t xml:space="preserve">Manager home → Team &amp; money</w:t>
+            </w:r>
+          </w:p>
+        </w:tc>
+      </w:tr>
+      <w:tr>
+        <w:tc>
+          <w:tcPr>
+            <w:tcW w:w="3120" w:type="dxa"/>
+          </w:tcPr>
+          <w:p>
+            <w:pPr/>
+            <w:r>
+              <w:t xml:space="preserve">Admin</w:t>
+            </w:r>
+          </w:p>
+        </w:tc>
+        <w:tc>
+          <w:tcPr>
+            <w:tcW w:w="3120" w:type="dxa"/>
+          </w:tcPr>
+          <w:p>
+            <w:pPr/>
+            <w:r>
+              <w:t xml:space="preserve">Branch comparison. Suppliers (payables, fill rate, rating, pay). Schemes &amp; loyalty builder (cashback, buy X get Y, bulk slab, mechanic target bonus). GST reports: GSTR-1 and the HSN summary. Backup &amp; export to CSV / Excel. KYC approvals.</w:t>
+            </w:r>
+          </w:p>
+        </w:tc>
+        <w:tc>
+          <w:tcPr>
+            <w:tcW w:w="3120" w:type="dxa"/>
+          </w:tcPr>
+          <w:p>
+            <w:pPr/>
+            <w:r>
+              <w:t xml:space="preserve">Admin home → Admin tools · Reports &amp; data</w:t>
+            </w:r>
+          </w:p>
+        </w:tc>
+      </w:tr>
+      <w:tr>
+        <w:tc>
+          <w:tcPr>
+            <w:tcW w:w="3120" w:type="dxa"/>
+          </w:tcPr>
+          <w:p>
+            <w:pPr/>
+            <w:r>
+              <w:t xml:space="preserve">Everyone</w:t>
+            </w:r>
+          </w:p>
+        </w:tc>
+        <w:tc>
+          <w:tcPr>
+            <w:tcW w:w="3120" w:type="dxa"/>
+          </w:tcPr>
+          <w:p>
+            <w:pPr/>
+            <w:r>
+              <w:t xml:space="preserve">Theme: Light / Dark / Auto. Language: English / ಕನ್ನಡ / हिन्दी. Offline mode: a banner shows how many changes are waiting and syncs them when you're back online.</w:t>
+            </w:r>
+          </w:p>
+        </w:tc>
+        <w:tc>
+          <w:tcPr>
+            <w:tcW w:w="3120" w:type="dxa"/>
+          </w:tcPr>
+          <w:p>
+            <w:pPr/>
+            <w:r>
+              <w:t xml:space="preserve">Account → App settings</w:t>
+            </w:r>
+          </w:p>
+        </w:tc>
+      </w:tr>
+    </w:tbl>
+    <w:p>
+      <w:pPr/>
+      <w:r>
+        <w:rPr>
+          <w:b/>
+        </w:rPr>
+        <w:t xml:space="preserve">New look.</w:t>
+      </w:r>
+      <w:r>
+        <w:t xml:space="preserve"> The palette is warm black and amber: an ivory background, soft card shadows, gradient yellow buttons, and matching teal, emerald and coral for information, success and alerts. Bike colour swatches keep their true colours.</w:t>
+      </w:r>
+    </w:p>
     <w:p>
       <w:pPr>
         <w:pStyle w:val="Heading2"/>

</xml_diff>